<commit_message>
Revise Chapter 1 (ভূমিকা) with tracked changes
Add Bangladeshi context (bKash, Pathao, Grameenphone examples),
"একটু ভাবো" interactive prompt, and fix দরকা→দরকার typo.
All edits as Word tracked changes for author review.

Co-Authored-By: Claude Opus 4.6 (1M context) <noreply@anthropic.com>
</commit_message>
<xml_diff>
--- a/chapters/01_ভূমিকা.docx
+++ b/chapters/01_ভূমিকা.docx
@@ -101,21 +101,47 @@
         <w:ind w:firstLine="360"/>
         <w:jc w:val="both"/>
       </w:pPr>
+      <w:ins w:id="100" w:author="Claude" w:date="2026-06-07T00:00:00Z">
+        <w:r>
+          <w:rPr>
+            <w:rFonts w:ascii="Noto Serif Bengali" w:hAnsi="Noto Serif Bengali" w:eastAsia="Noto Serif Bengali" w:cs="Noto Serif Bengali"/>
+            <w:sz w:val="24"/>
+            <w:szCs w:val="24"/>
+          </w:rPr>
+          <w:t>বিকাশে টাকা পাঠানোর সময় যখন তোমার ফোনে একটা সতর্কতা আসে — “এই লেনদেনটি কি সত্যিই তুমি করেছ?” — সেখানে একটা এআই মডেল তোমার আগের লেনদেনের ধরন দেখে সিদ্ধান্ত নিচ্ছে এটা সন্দেহজনক কিনা। Pathao-তে রাইড খোঁজার সময় যে দাম দেখাচ্ছে, সেটাও একটা এআই সিদ্ধান্ত — ট্রাফিক, চাহিদা, আর দূরত্ব মিলিয়ে। গ্রামীণফোনের MyGP অ্যাপ যখন তোমাকে একটা নির্দিষ্ট ডেটা প্যাক সুপারিশ করে, সেটাও তোমার ব্যবহারের ধরন দেখে নেওয়া একটা সিদ্ধান্ত।</w:t>
+        </w:r>
+      </w:ins>
+    </w:p>
+    <w:p>
+      <w:pPr>
+        <w:spacing w:after="180" w:before="0" w:line="360" w:lineRule="auto"/>
+        <w:ind w:firstLine="360"/>
+        <w:jc w:val="both"/>
+      </w:pPr>
+      <w:ins w:id="101" w:author="Claude" w:date="2026-06-07T00:00:00Z">
+        <w:r>
+          <w:rPr>
+            <w:rFonts w:ascii="Noto Serif Bengali" w:hAnsi="Noto Serif Bengali" w:eastAsia="Noto Serif Bengali" w:cs="Noto Serif Bengali"/>
+            <w:sz w:val="24"/>
+            <w:szCs w:val="24"/>
+          </w:rPr>
+          <w:t>এই এআইগুলো তোমার হয়ে সিদ্ধান্ত নিচ্ছে — তাহলে ওরা কেমনে নেয়, কী দেখে নেয়, কোথায় ভুল করে, সেটা জানাটা তোমার অধিকার। এই বই সেই জানাটাই সহজ করবে।</w:t>
+        </w:r>
+      </w:ins>
+    </w:p>
+    <w:p>
+      <w:pPr>
+        <w:spacing w:after="180" w:before="0" w:line="360" w:lineRule="auto"/>
+        <w:ind w:firstLine="360"/>
+        <w:jc w:val="both"/>
+      </w:pPr>
       <w:r>
         <w:rPr>
           <w:rFonts w:ascii="Noto Serif Bengali" w:hAnsi="Noto Serif Bengali" w:eastAsia="Noto Serif Bengali" w:cs="Noto Serif Bengali"/>
           <w:sz w:val="24"/>
           <w:szCs w:val="24"/>
         </w:rPr>
-        <w:t xml:space="preserve">ব্যাপারটা হলো, আমরা প্রতিদিন কয়েক ডজনবার এআই ব্যবহার করি, অথচ সেটা নিয়ে ভাবিই না। আমরা শুধু ট্যাপ করি, স্ক্রল করি, সোয়াইপ করি — আর এআই চুপচাপ নির্ধারণ করে দেয় আমরা কী দেখব, কী শুনব, এমনকি কী চাইব। এটা কিন্তু বেশ বড় বিষয়। তবুও বেশিরভাগ মানুষের কাছে এটা কীভাবে কাজ করে তা একটা সম্পূর্ণ রহস্য। </w:t>
-      </w:r>
-      <w:r>
-        <w:rPr>
-          <w:rFonts w:ascii="Noto Serif Bengali" w:hAnsi="Noto Serif Bengali" w:eastAsia="Noto Serif Bengali" w:cs="Noto Serif Bengali"/>
-          <w:sz w:val="24"/>
-          <w:szCs w:val="24"/>
-        </w:rPr>
-        <w:t>এই বইটা সেই রহস্যটা ভাঙতেই লেখা।</w:t>
+        <w:t>ব্যাপারটা হলো, আমরা প্রতিদিন কয়েক ডজনবার এআই ব্যবহার করি, অথচ সেটা নিয়ে ভাবিই না। আমরা শুধু ট্যাপ করি, স্ক্রল করি, সোয়াইপ করি — আর এআই চুপচাপ নির্ধারণ করে দেয় আমরা কী দেখব, কী শুনব, এমনকি কী চাইব। এটা কিন্তু বেশ বড় বিষয়। তবুও বেশিরভাগ মানুষের কাছে এটা কীভাবে কাজ করে তা একটা সম্পূর্ণ রহস্য। এই বইটা সেই রহস্যটা ভাঙতেই লেখা।</w:t>
       </w:r>
     </w:p>
     <w:p>
@@ -135,18 +161,7 @@
           <w:sz w:val="32"/>
           <w:szCs w:val="32"/>
         </w:rPr>
-        <w:t>এই বইটা তোমার জন্য — যদিও</w:t>
-      </w:r>
-      <w:r>
-        <w:rPr>
-          <w:rFonts w:ascii="Noto Serif Bengali" w:hAnsi="Noto Serif Bengali" w:eastAsia="Noto Serif Bengali" w:cs="Noto Serif Bengali"/>
-          <w:b/>
-          <w:bCs/>
-          <w:color w:val="2E4057"/>
-          <w:sz w:val="32"/>
-          <w:szCs w:val="32"/>
-        </w:rPr>
-        <w:t xml:space="preserve"> তোমার গণিত ভাল লাগে না</w:t>
+        <w:t>এই বইটা তোমার জন্য — যদিও তোমার গণিত ভাল লাগে না</w:t>
       </w:r>
     </w:p>
     <w:p>
@@ -161,7 +176,35 @@
           <w:sz w:val="24"/>
           <w:szCs w:val="24"/>
         </w:rPr>
-        <w:t>প্রথমেই একটা কথা পরিষ্কার করে নেওয়া দরকা, এআই বুঝতে গণিতে ভালো হতে হয় না। কোড লিখতে জানতে হয় না। কোনো বিশেষ ক্লাস করতে হয় না। শুধু কৌতূহল থাকলেই চলে — আর এই বইটা তুলে নেওয়া মানে সেটা তোমার মধ্যে আছেই।</w:t>
+        <w:t>প্রথমেই একটা কথা পরিষ্কার করে নেওয়া দরকা</w:t>
+      </w:r>
+      <w:del w:id="104" w:author="Claude" w:date="2026-06-07T00:00:00Z">
+        <w:r>
+          <w:rPr>
+            <w:rFonts w:ascii="Noto Serif Bengali" w:hAnsi="Noto Serif Bengali" w:eastAsia="Noto Serif Bengali" w:cs="Noto Serif Bengali"/>
+            <w:sz w:val="24"/>
+            <w:szCs w:val="24"/>
+          </w:rPr>
+          <w:delText>,</w:delText>
+        </w:r>
+      </w:del>
+      <w:ins w:id="105" w:author="Claude" w:date="2026-06-07T00:00:00Z">
+        <w:r>
+          <w:rPr>
+            <w:rFonts w:ascii="Noto Serif Bengali" w:hAnsi="Noto Serif Bengali" w:eastAsia="Noto Serif Bengali" w:cs="Noto Serif Bengali"/>
+            <w:sz w:val="24"/>
+            <w:szCs w:val="24"/>
+          </w:rPr>
+          <w:t>র।</w:t>
+        </w:r>
+      </w:ins>
+      <w:r>
+        <w:rPr>
+          <w:rFonts w:ascii="Noto Serif Bengali" w:hAnsi="Noto Serif Bengali" w:eastAsia="Noto Serif Bengali" w:cs="Noto Serif Bengali"/>
+          <w:sz w:val="24"/>
+          <w:szCs w:val="24"/>
+        </w:rPr>
+        <w:t xml:space="preserve"> এআই বুঝতে গণিতে ভালো হতে হয় না। কোড লিখতে জানতে হয় না। কোনো বিশেষ ক্লাস করতে হয় না। শুধু কৌতূহল থাকলেই চলে — আর এই বইটা তুলে নেওয়া মানে সেটা তোমার মধ্যে আছেই।</w:t>
       </w:r>
     </w:p>
     <w:p>
@@ -347,6 +390,59 @@
         </w:rPr>
         <w:t>তাহলে শুরু করা যাক একদম গোড়া থেকে। একটা ছোট প্রশ্ন দিয়ে, একটা যন্ত্র কীভাবে সিদ্ধান্ত নিতে শেখে?</w:t>
       </w:r>
+    </w:p>
+    <w:p>
+      <w:pPr>
+        <w:spacing w:after="100" w:before="0" w:line="360" w:lineRule="auto"/>
+        <w:ind w:firstLine="0"/>
+      </w:pPr>
+    </w:p>
+    <w:p>
+      <w:pPr>
+        <w:pBdr>
+          <w:top w:val="single" w:color="2E74B5" w:sz="4" w:space="3"/>
+          <w:left w:val="single" w:color="2E74B5" w:sz="12" w:space="8"/>
+        </w:pBdr>
+        <w:spacing w:after="60" w:before="120" w:line="360" w:lineRule="auto"/>
+        <w:ind w:firstLine="360" w:left="360"/>
+        <w:jc w:val="both"/>
+      </w:pPr>
+      <w:ins w:id="102" w:author="Claude" w:date="2026-06-07T00:00:00Z">
+        <w:r>
+          <w:rPr>
+            <w:rFonts w:ascii="Noto Serif Bengali" w:hAnsi="Noto Serif Bengali" w:eastAsia="Noto Serif Bengali" w:cs="Noto Serif Bengali"/>
+            <w:b/>
+            <w:bCs/>
+            <w:color w:val="2E74B5"/>
+            <w:sz w:val="24"/>
+            <w:szCs w:val="24"/>
+          </w:rPr>
+          <w:t>একটু ভাবো</w:t>
+        </w:r>
+      </w:ins>
+    </w:p>
+    <w:p>
+      <w:pPr>
+        <w:pBdr>
+          <w:left w:val="single" w:color="2E74B5" w:sz="12" w:space="8"/>
+        </w:pBdr>
+        <w:spacing w:after="120" w:before="0" w:line="360" w:lineRule="auto"/>
+        <w:ind w:firstLine="360" w:left="360"/>
+        <w:jc w:val="both"/>
+      </w:pPr>
+      <w:ins w:id="103" w:author="Claude" w:date="2026-06-07T00:00:00Z">
+        <w:r>
+          <w:rPr>
+            <w:rFonts w:ascii="Noto Serif Bengali" w:hAnsi="Noto Serif Bengali" w:eastAsia="Noto Serif Bengali" w:cs="Noto Serif Bengali"/>
+            <w:i/>
+            <w:iCs/>
+            <w:color w:val="333333"/>
+            <w:sz w:val="24"/>
+            <w:szCs w:val="24"/>
+          </w:rPr>
+          <w:t>তোমার দৈনন্দিন জীবনে কোন কোন সিদ্ধান্ত এআই নিচ্ছে বলে তুমি মনে কর? ফোন আনলক করা থেকে শুরু করে YouTube-এর পরামর্শ পর্যন্ত — তিনটে তালিকা করো।</w:t>
+        </w:r>
+      </w:ins>
     </w:p>
     <w:p>
       <w:pPr>

</xml_diff>